<commit_message>
Water scarcity citizen-v3.0: single-line headers and widow-free formatting polish
Co-authored-by: CaptainWrechols <CaptainWrechols@users.noreply.github.com>
</commit_message>
<xml_diff>
--- a/briefs/nevada/water-scarcity/citizen-v3/citizen-brief.docx
+++ b/briefs/nevada/water-scarcity/citizen-v3/citizen-brief.docx
@@ -4,6 +4,7 @@
   <w:body>
     <w:p>
       <w:pPr>
+        <w:widowControl/>
         <w:spacing w:before="0" w:after="20" w:lineRule="auto" w:line="254"/>
       </w:pPr>
       <w:r>
@@ -19,6 +20,7 @@
     </w:p>
     <w:p>
       <w:pPr>
+        <w:widowControl/>
         <w:spacing w:before="0" w:after="120" w:lineRule="auto" w:line="254"/>
         <w:pBdr>
           <w:bottom w:val="single" w:sz="20" w:space="2" w:color="1A2D4F"/>
@@ -27,6 +29,7 @@
     </w:p>
     <w:p>
       <w:pPr>
+        <w:widowControl/>
         <w:spacing w:before="0" w:after="40" w:lineRule="auto" w:line="252"/>
       </w:pPr>
       <w:r>
@@ -41,6 +44,7 @@
     </w:p>
     <w:p>
       <w:pPr>
+        <w:widowControl/>
         <w:spacing w:before="0" w:after="120" w:lineRule="auto" w:line="254"/>
       </w:pPr>
       <w:r>
@@ -50,11 +54,12 @@
           <w:color w:val="444444"/>
           <w:sz w:val="17"/>
         </w:rPr>
-        <w:t>The legislative record behind Nevadans' ten most common water proposals, 2019–2025 — organized by how far each idea has traveled toward law.</w:t>
+        <w:t>The legislative record behind Nevadans' ten most common water proposals, 2019–2025 — organized by how far each idea has traveled toward law.</w:t>
       </w:r>
     </w:p>
     <w:p>
       <w:pPr>
+        <w:widowControl/>
         <w:spacing w:before="100" w:after="50" w:lineRule="auto" w:line="254"/>
       </w:pPr>
       <w:r>
@@ -70,6 +75,7 @@
     </w:p>
     <w:p>
       <w:pPr>
+        <w:widowControl/>
         <w:spacing w:before="0" w:after="64" w:lineRule="auto" w:line="250"/>
         <w:jc w:val="both"/>
       </w:pPr>
@@ -80,11 +86,12 @@
           <w:color w:val="444444"/>
           <w:sz w:val="17"/>
         </w:rPr>
-        <w:t>Nevada's Legislature took up 108 water and large-user bills across its 2019, 2021, 2023, and 2025 sessions, and 59 became law — water legislation moves in Carson City every session. Several of the reforms Nevadans proposed have traveled farther than a first glance suggests: four bills passed both chambers since 2023 and stopped one step short of statute, and others cleared a full chamber or a committee before running out of calendar. The sections below sort the record by distance traveled — bills that reached the governor's desk first, then bills with a winning vote behind them, then settled law and its openings, then the routes with no traction yet — with notes on momentum, federal overlap, and sponsors.</w:t>
+        <w:t>Nevada's Legislature took up 108 water and large-user bills across its 2019, 2021, 2023, and 2025 sessions, and 59 became law — water legislation moves in Carson City every session. Several of the reforms Nevadans proposed have traveled farther than a first glance suggests: four bills passed both chambers since 2023 and stopped one step short of statute, and others cleared a full chamber or a committee before running out of calendar. The sections below sort the record by distance traveled — bills that reached the governor's desk first, then bills with a winning vote behind them, then settled law and its openings, then the routes with no traction yet — with notes on momentum, federal overlap, and sponsors.</w:t>
       </w:r>
     </w:p>
     <w:p>
       <w:pPr>
+        <w:widowControl/>
         <w:spacing w:before="100" w:after="50" w:lineRule="auto" w:line="254"/>
       </w:pPr>
       <w:r>
@@ -95,11 +102,12 @@
           <w:sz w:val="21"/>
           <w:spacing w:val="20"/>
         </w:rPr>
-        <w:t>KEY NUMBERS: HOW FAR WATER PROPOSALS HAVE TRAVELED</w:t>
+        <w:t>KEY NUMBERS: HOW FAR THESE PROPOSALS HAVE TRAVELED</w:t>
       </w:r>
     </w:p>
     <w:p>
       <w:pPr>
+        <w:widowControl/>
         <w:spacing w:before="0" w:after="60" w:lineRule="auto" w:line="254"/>
       </w:pPr>
       <w:r>
@@ -357,11 +365,13 @@
     </w:tbl>
     <w:p>
       <w:pPr>
+        <w:widowControl/>
         <w:spacing w:before="0" w:after="100" w:lineRule="auto" w:line="254"/>
       </w:pPr>
     </w:p>
     <w:p>
       <w:pPr>
+        <w:widowControl/>
         <w:spacing w:before="100" w:after="50" w:lineRule="auto" w:line="254"/>
       </w:pPr>
       <w:r>
@@ -372,11 +382,12 @@
           <w:sz w:val="21"/>
           <w:spacing w:val="20"/>
         </w:rPr>
-        <w:t>CLOSEST TO LAW: BILLS THAT PASSED BOTH CHAMBERS AND STOPPED AT THE LAST STEP</w:t>
+        <w:t>CLOSEST TO LAW: BILLS THAT PASSED BOTH CHAMBERS</w:t>
       </w:r>
     </w:p>
     <w:p>
       <w:pPr>
+        <w:widowControl/>
         <w:spacing w:before="0" w:after="50" w:lineRule="auto" w:line="250"/>
       </w:pPr>
       <w:r>
@@ -387,11 +398,12 @@
           <w:color w:val="666666"/>
           <w:sz w:val="15"/>
         </w:rPr>
-        <w:t>These bills assembled majorities in both houses; only a veto or the session clock separated them from statute — the record's most advanced unfinished work.</w:t>
+        <w:t>These bills assembled majorities in both houses; only a veto or the session clock separated them from statute — the record's most advanced unfinished work.</w:t>
       </w:r>
     </w:p>
     <w:p>
       <w:pPr>
+        <w:widowControl/>
         <w:spacing w:before="70" w:after="30" w:lineRule="auto" w:line="250"/>
       </w:pPr>
       <w:r>
@@ -406,6 +418,7 @@
     </w:p>
     <w:p>
       <w:pPr>
+        <w:widowControl/>
         <w:spacing w:before="0" w:after="64" w:lineRule="auto" w:line="250"/>
         <w:jc w:val="both"/>
       </w:pPr>
@@ -425,11 +438,12 @@
           <w:color w:val="444444"/>
           <w:sz w:val="17"/>
         </w:rPr>
-        <w:t xml:space="preserve"> Attached family-leave conditions to the up-front tax abatements that recruit large water users; passed both houses and was vetoed. It is the only abatement-conditions design to clear the full Legislature.</w:t>
+        <w:t xml:space="preserve"> Attached family-leave conditions to the up-front tax abatements that recruit large water users; passed both houses and was vetoed. It is the only abatement-conditions design to clear the full Legislature.</w:t>
       </w:r>
     </w:p>
     <w:p>
       <w:pPr>
+        <w:widowControl/>
         <w:spacing w:before="0" w:after="64" w:lineRule="auto" w:line="250"/>
         <w:jc w:val="both"/>
       </w:pPr>
@@ -449,11 +463,12 @@
           <w:color w:val="444444"/>
           <w:sz w:val="17"/>
         </w:rPr>
-        <w:t xml:space="preserve"> Added conservation elements to local government master plans; passed both houses and was vetoed.</w:t>
+        <w:t xml:space="preserve"> Added conservation elements to local government master plans; passed both houses and was vetoed.</w:t>
       </w:r>
     </w:p>
     <w:p>
       <w:pPr>
+        <w:widowControl/>
         <w:spacing w:before="0" w:after="64" w:lineRule="auto" w:line="250"/>
         <w:jc w:val="both"/>
       </w:pPr>
@@ -473,11 +488,12 @@
           <w:color w:val="444444"/>
           <w:sz w:val="17"/>
         </w:rPr>
-        <w:t xml:space="preserve"> Would have blocked local governments from banning newer refrigerants in cooling equipment; passed 42–0 and 20–0 — unanimous in both chambers — and was vetoed. Its sponsor, Assemblymember Melissa Hardy (R), is still a member of the Assembly.</w:t>
+        <w:t xml:space="preserve"> Would have blocked local governments from banning newer refrigerants in cooling equipment; passed 42–0 and 20–0 — unanimous in both chambers — and was vetoed. Its sponsor, Assemblymember Melissa Hardy (R), is still a member of the Assembly.</w:t>
       </w:r>
     </w:p>
     <w:p>
       <w:pPr>
+        <w:widowControl/>
         <w:spacing w:before="70" w:after="30" w:lineRule="auto" w:line="250"/>
       </w:pPr>
       <w:r>
@@ -492,6 +508,7 @@
     </w:p>
     <w:p>
       <w:pPr>
+        <w:widowControl/>
         <w:spacing w:before="0" w:after="64" w:lineRule="auto" w:line="250"/>
         <w:jc w:val="both"/>
       </w:pPr>
@@ -511,11 +528,12 @@
           <w:color w:val="444444"/>
           <w:sz w:val="17"/>
         </w:rPr>
-        <w:t xml:space="preserve"> Passed both houses with zero "no" votes and still died at session's end without reaching the governor. The 2025 retry, AB363, cleared its committee and died on the Assembly floor calendar. Two sessions of near-unanimous support make this the record's clearest piece of unfinished business.</w:t>
+        <w:t xml:space="preserve"> Passed both houses with zero "no" votes and still died at session's end without reaching the governor. The 2025 retry, AB363, cleared its committee and died on the Assembly floor calendar. Two sessions of near-unanimous support make this the record's clearest piece of unfinished business.</w:t>
       </w:r>
     </w:p>
     <w:p>
       <w:pPr>
+        <w:widowControl/>
         <w:spacing w:before="100" w:after="50" w:lineRule="auto" w:line="254"/>
       </w:pPr>
       <w:r>
@@ -526,11 +544,12 @@
           <w:sz w:val="21"/>
           <w:spacing w:val="20"/>
         </w:rPr>
-        <w:t>DEMONSTRATED SUPPORT: BILLS THAT CLEARED ONE CHAMBER OR A COMMITTEE</w:t>
+        <w:t>PROVEN SUPPORT: BILLS THAT CLEARED A CHAMBER OR A COMMITTEE</w:t>
       </w:r>
     </w:p>
     <w:p>
       <w:pPr>
+        <w:widowControl/>
         <w:spacing w:before="0" w:after="50" w:lineRule="auto" w:line="250"/>
       </w:pPr>
       <w:r>
@@ -541,11 +560,12 @@
           <w:color w:val="666666"/>
           <w:sz w:val="15"/>
         </w:rPr>
-        <w:t>Each bill here won a recorded majority — in committee or on a floor — before stalling: the strongest signal short of passage.</w:t>
+        <w:t>Each bill here won a recorded majority — in committee or on a floor — before stalling: the strongest signal short of passage.</w:t>
       </w:r>
     </w:p>
     <w:p>
       <w:pPr>
+        <w:widowControl/>
         <w:spacing w:before="0" w:after="64" w:lineRule="auto" w:line="250"/>
         <w:jc w:val="both"/>
       </w:pPr>
@@ -565,11 +585,12 @@
           <w:color w:val="444444"/>
           <w:sz w:val="17"/>
         </w:rPr>
-        <w:t xml:space="preserve"> Directed an interim review of water conservation policy; passed the Senate 21–0 and died in the Assembly. The earlier version, SB499 (2019), never left its first committee — so the idea's newest test is also its strongest showing. No Economic Forum-style water body exists in statute.</w:t>
+        <w:t xml:space="preserve"> Directed an interim review of water conservation policy; passed the Senate 21–0 and died in the Assembly. The earlier version, SB499 (2019), never left its first committee — so the idea's newest test is also its strongest showing. No Economic Forum-style water body exists in statute.</w:t>
       </w:r>
     </w:p>
     <w:p>
       <w:pPr>
+        <w:widowControl/>
         <w:spacing w:before="0" w:after="64" w:lineRule="auto" w:line="250"/>
         <w:jc w:val="both"/>
       </w:pPr>
@@ -589,11 +610,12 @@
           <w:color w:val="444444"/>
           <w:sz w:val="17"/>
         </w:rPr>
-        <w:t xml:space="preserve"> Required the State Engineer to use the best available science; passed the Assembly 26–14 and died in the Senate.</w:t>
+        <w:t xml:space="preserve"> Required the State Engineer to use the best available science; passed the Assembly 26–14 and died in the Senate.</w:t>
       </w:r>
     </w:p>
     <w:p>
       <w:pPr>
+        <w:widowControl/>
         <w:spacing w:before="0" w:after="64" w:lineRule="auto" w:line="250"/>
         <w:jc w:val="both"/>
       </w:pPr>
@@ -631,11 +653,12 @@
           <w:color w:val="444444"/>
           <w:sz w:val="17"/>
         </w:rPr>
-        <w:t>, conditioning data-center abatements, cleared its first committee and stalled on the Senate floor. Assembly Revenue is where abatement designs stop — but the Senate has now voted for one.</w:t>
+        <w:t>, conditioning data-center abatements, cleared its first committee and stalled on the Senate floor. Assembly Revenue is where abatement designs stop — but the Senate has now voted for one.</w:t>
       </w:r>
     </w:p>
     <w:p>
       <w:pPr>
+        <w:widowControl/>
         <w:spacing w:before="100" w:after="50" w:lineRule="auto" w:line="254"/>
       </w:pPr>
       <w:r>
@@ -651,6 +674,7 @@
     </w:p>
     <w:p>
       <w:pPr>
+        <w:widowControl/>
         <w:spacing w:before="0" w:after="50" w:lineRule="auto" w:line="250"/>
       </w:pPr>
       <w:r>
@@ -661,11 +685,12 @@
           <w:color w:val="666666"/>
           <w:sz w:val="15"/>
         </w:rPr>
-        <w:t>Fresh statutes mark ground unlikely to be revisited soon — and the lanes where the Legislature keeps building.</w:t>
+        <w:t>Fresh statutes mark ground unlikely to be revisited soon — and the lanes where the Legislature keeps building.</w:t>
       </w:r>
     </w:p>
     <w:p>
       <w:pPr>
+        <w:widowControl/>
         <w:spacing w:before="70" w:after="30" w:lineRule="auto" w:line="250"/>
       </w:pPr>
       <w:r>
@@ -680,6 +705,7 @@
     </w:p>
     <w:p>
       <w:pPr>
+        <w:widowControl/>
         <w:spacing w:before="0" w:after="64" w:lineRule="auto" w:line="250"/>
         <w:jc w:val="both"/>
       </w:pPr>
@@ -690,11 +716,12 @@
           <w:color w:val="444444"/>
           <w:sz w:val="17"/>
         </w:rPr>
-        <w:t>SB36 created the state account to purchase and retire water rights in over-appropriated basins. SB6 funded cloud seeding a second time, unanimously. SB442 added utility shut-off protections; SB276 added public-notice requirements for water pollution permits with cross-party sponsorship; AB449 and SB326 simplified rate procedures for small water utilities; AB577 funded the water agency's records database. New proposals that restate these — another retirement account, another records appropriation — would duplicate fresh statute and are unlikely to advance.</w:t>
+        <w:t>SB36 created the state account to purchase and retire water rights in over-appropriated basins. SB6 funded cloud seeding a second time, unanimously. SB442 added utility shut-off protections; SB276 added public-notice requirements for water pollution permits with cross-party sponsorship; AB449 and SB326 simplified rate procedures for small water utilities; AB577 funded the water agency's records database. New proposals that restate these — another retirement account, another records appropriation — would duplicate fresh statute and are unlikely to advance.</w:t>
       </w:r>
     </w:p>
     <w:p>
       <w:pPr>
+        <w:widowControl/>
         <w:spacing w:before="70" w:after="30" w:lineRule="auto" w:line="250"/>
       </w:pPr>
       <w:r>
@@ -709,6 +736,7 @@
     </w:p>
     <w:p>
       <w:pPr>
+        <w:widowControl/>
         <w:spacing w:before="0" w:after="64" w:lineRule="auto" w:line="250"/>
         <w:jc w:val="both"/>
       </w:pPr>
@@ -719,11 +747,12 @@
           <w:color w:val="444444"/>
           <w:sz w:val="17"/>
         </w:rPr>
-        <w:t>SB36 is the pattern to watch: the buy-and-retire design failed in 2021 and 2023 before passing in 2025 — the Legislature returned to it until it worked. The precedents run the same way: AB356 (2021) banned decorative Colorado River grass in southern Nevada 21–0 and 42–0, proof that a hard restriction passes when regionally scoped; SB250 (2019) tied land divisions to water-right dedication, 39–0; AB95 (2019) required domestic-well metering in stressed basins and SB113 (2023) extended it; AB191 (2023) made suppliers audit their water losses. Each is a base that later bills have widened rather than a ceiling.</w:t>
+        <w:t>SB36 is the pattern to watch: the buy-and-retire design failed in 2021 and 2023 before passing in 2025 — the Legislature returned to it until it worked. The precedents run the same way: AB356 (2021) banned decorative Colorado River grass in southern Nevada 21–0 and 42–0, proof that a hard restriction passes when regionally scoped; SB250 (2019) tied land divisions to water-right dedication, 39–0; AB95 (2019) required domestic-well metering in stressed basins and SB113 (2023) extended it; AB191 (2023) made suppliers audit their water losses. Each is a base that later bills have widened rather than a ceiling.</w:t>
       </w:r>
     </w:p>
     <w:p>
       <w:pPr>
+        <w:widowControl/>
         <w:spacing w:before="100" w:after="50" w:lineRule="auto" w:line="254"/>
       </w:pPr>
       <w:r>
@@ -734,11 +763,12 @@
           <w:sz w:val="21"/>
           <w:spacing w:val="20"/>
         </w:rPr>
-        <w:t>ROUTES WITH LITTLE TRACTION YET: NEVER FILED, NEVER HEARD, OR STOPPED EARLY</w:t>
+        <w:t>ROUTES WITH LITTLE TRACTION: NEVER FILED OR STOPPED EARLY</w:t>
       </w:r>
     </w:p>
     <w:p>
       <w:pPr>
+        <w:widowControl/>
         <w:spacing w:before="0" w:after="50" w:lineRule="auto" w:line="250"/>
       </w:pPr>
       <w:r>
@@ -749,11 +779,12 @@
           <w:color w:val="666666"/>
           <w:sz w:val="15"/>
         </w:rPr>
-        <w:t>Nothing here has won a vote — never filed, never heard in committee, or stopped early. The least-traveled routes: unproven rather than closed.</w:t>
+        <w:t>Nothing here has won a vote — never filed, never heard in committee, or stopped early. The least-traveled routes: unproven rather than closed.</w:t>
       </w:r>
     </w:p>
     <w:p>
       <w:pPr>
+        <w:widowControl/>
         <w:spacing w:before="0" w:after="64" w:lineRule="auto" w:line="250"/>
         <w:jc w:val="both"/>
       </w:pPr>
@@ -773,11 +804,12 @@
           <w:color w:val="444444"/>
           <w:sz w:val="17"/>
         </w:rPr>
-        <w:t xml:space="preserve"> Never filed. The existing statutes run the other way — SB547 (2019) let data centers run their own power equipment free of utility regulation, and the abatement statutes recruit them. Cooling rules are local (the Southern Nevada Water Authority's evaporative-cooling moratorium is a water-authority rule, not state law), and AB385 (2025), which would have barred local bans on large water-cooled towers, died in its first committee. The forward signal: interim committees studied data-center water and energy through 2026 for the 2027 session.</w:t>
+        <w:t xml:space="preserve"> Never filed. The existing statutes run the other way — SB547 (2019) let data centers run their own power equipment free of utility regulation, and the abatement statutes recruit them. Cooling rules are local (the Southern Nevada Water Authority's evaporative-cooling moratorium is a water-authority rule, not state law), and AB385 (2025), which would have barred local bans on large water-cooled towers, died in its first committee. The forward signal: interim committees studied data-center water and energy through 2026 for the 2027 session.</w:t>
       </w:r>
     </w:p>
     <w:p>
       <w:pPr>
+        <w:widowControl/>
         <w:spacing w:before="0" w:after="64" w:lineRule="auto" w:line="250"/>
         <w:jc w:val="both"/>
       </w:pPr>
@@ -797,11 +829,12 @@
           <w:color w:val="444444"/>
           <w:sz w:val="17"/>
         </w:rPr>
-        <w:t xml:space="preserve"> None has ever been filed. Metering's edges exist in law (AB95, SB113, AB191), but retail metering remains a city and utility decision. The nearest waste statute, AB537 (2019), raised penalties for pollution — not landscape watering. The reimbursement design participants developed — tax breaks paid only after public-benefit metrics are met — has never been introduced in any form.</w:t>
+        <w:t xml:space="preserve"> None has ever been filed. Metering's edges exist in law (AB95, SB113, AB191), but retail metering remains a city and utility decision. The nearest waste statute, AB537 (2019), raised penalties for pollution — not landscape watering. The reimbursement design participants developed — tax breaks paid only after public-benefit metrics are met — has never been introduced in any form.</w:t>
       </w:r>
     </w:p>
     <w:p>
       <w:pPr>
+        <w:widowControl/>
         <w:spacing w:before="0" w:after="64" w:lineRule="auto" w:line="250"/>
         <w:jc w:val="both"/>
       </w:pPr>
@@ -821,11 +854,12 @@
           <w:color w:val="444444"/>
           <w:sz w:val="17"/>
         </w:rPr>
-        <w:t xml:space="preserve"> Never filed statewide. Northern Nevada already operates this way — Truckee Meadows developers must dedicate water rights plus an 11 percent drought reserve — but by water-authority rule, not statute; SB250 (2019) is the nearest law.</w:t>
+        <w:t xml:space="preserve"> Never filed statewide. Northern Nevada already operates this way — Truckee Meadows developers must dedicate water rights plus an 11 percent drought reserve — but by water-authority rule, not statute; SB250 (2019) is the nearest law.</w:t>
       </w:r>
     </w:p>
     <w:p>
       <w:pPr>
+        <w:widowControl/>
         <w:spacing w:before="0" w:after="64" w:lineRule="auto" w:line="250"/>
         <w:jc w:val="both"/>
       </w:pPr>
@@ -845,11 +879,12 @@
           <w:color w:val="444444"/>
           <w:sz w:val="17"/>
         </w:rPr>
-        <w:t xml:space="preserve"> AB485 (2025) — basin water budgets, monitoring, digitized records, staff for old claims — died in its first committee. But its pieces passed one by one: basin studies (AB95), critical management areas (SB113), the records database (AB577), the retirement account (SB36). The record's pattern is incremental, not omnibus. Early deaths also took AB51 (2019, conjunctive management), AB449 (2021) and AB77 (2025, abatement conditions in Assembly Revenue), and State Engineer oversight is 0-for-6 since 2021.</w:t>
+        <w:t xml:space="preserve"> AB485 (2025) — basin water budgets, monitoring, digitized records, staff for old claims — died in its first committee. But its pieces passed one by one: basin studies (AB95), critical management areas (SB113), the records database (AB577), the retirement account (SB36). The record's pattern is incremental, not omnibus. Early deaths also took AB51 (2019, conjunctive management), AB449 (2021) and AB77 (2025, abatement conditions in Assembly Revenue), and State Engineer oversight is 0-for-6 since 2021.</w:t>
       </w:r>
     </w:p>
     <w:p>
       <w:pPr>
+        <w:widowControl/>
         <w:spacing w:before="100" w:after="50" w:lineRule="auto" w:line="254"/>
       </w:pPr>
       <w:r>
@@ -865,6 +900,7 @@
     </w:p>
     <w:p>
       <w:pPr>
+        <w:widowControl/>
         <w:spacing w:before="0" w:after="50" w:lineRule="auto" w:line="250"/>
       </w:pPr>
       <w:r>
@@ -875,11 +911,12 @@
           <w:color w:val="666666"/>
           <w:sz w:val="15"/>
         </w:rPr>
-        <w:t>Where bills keep appearing and advancing — and where the Legislature has not yet shown willingness to legislate.</w:t>
+        <w:t>Where bills keep appearing and advancing — and where the Legislature has not yet shown willingness to legislate.</w:t>
       </w:r>
     </w:p>
     <w:p>
       <w:pPr>
+        <w:widowControl/>
         <w:spacing w:before="0" w:after="64" w:lineRule="auto" w:line="250"/>
         <w:jc w:val="both"/>
       </w:pPr>
@@ -917,11 +954,12 @@
           <w:color w:val="444444"/>
           <w:sz w:val="17"/>
         </w:rPr>
-        <w:t xml:space="preserve"> statewide metering, escalating waste fines, and reimbursement-style incentives have never drawn a single bill; State Engineer oversight is 0-for-6; statewide (rather than regional) mandates have not yet found a sponsor who can move them.</w:t>
+        <w:t xml:space="preserve"> statewide metering, escalating waste fines, and reimbursement-style incentives have never drawn a single bill; State Engineer oversight is 0-for-6; statewide (rather than regional) mandates have not yet found a sponsor who can move them.</w:t>
       </w:r>
     </w:p>
     <w:p>
       <w:pPr>
+        <w:widowControl/>
         <w:spacing w:before="100" w:after="50" w:lineRule="auto" w:line="254"/>
       </w:pPr>
       <w:r>
@@ -937,6 +975,7 @@
     </w:p>
     <w:p>
       <w:pPr>
+        <w:widowControl/>
         <w:spacing w:before="0" w:after="50" w:lineRule="auto" w:line="250"/>
       </w:pPr>
       <w:r>
@@ -947,11 +986,12 @@
           <w:color w:val="666666"/>
           <w:sz w:val="15"/>
         </w:rPr>
-        <w:t>Where federal action already covers ground, a state bill duplicates it; where none exists, the state route is the only one.</w:t>
+        <w:t>Where federal action already covers ground, a state bill duplicates it; where none exists, the state route is the only one.</w:t>
       </w:r>
     </w:p>
     <w:p>
       <w:pPr>
+        <w:widowControl/>
         <w:spacing w:before="0" w:after="64" w:lineRule="auto" w:line="250"/>
         <w:jc w:val="both"/>
       </w:pPr>
@@ -962,11 +1002,12 @@
           <w:color w:val="444444"/>
           <w:sz w:val="17"/>
         </w:rPr>
-        <w:t>Nevada's Colorado River share is fixed by interstate compact and federal operations — the Bureau of Reclamation sets shortage rules, and the post-2026 operating guidelines are being negotiated at the federal level now — so state bills cannot change the allocation itself. Federal drought-response money appropriated in 2022 already pays Colorado River users for measured conservation, overlapping part of the reimbursement-incentive idea. By contrast, groundwater management, metering, waste enforcement, and data-center water standards have no federal statute: those fronts are state or local by default, with no redundancy risk.</w:t>
+        <w:t>Nevada's Colorado River share is fixed by interstate compact and federal operations — the Bureau of Reclamation sets shortage rules, and the post-2026 operating guidelines are being negotiated at the federal level now — so state bills cannot change the allocation itself. Federal drought-response money appropriated in 2022 already pays Colorado River users for measured conservation, overlapping part of the reimbursement-incentive idea. By contrast, groundwater management, metering, waste enforcement, and data-center water standards have no federal statute: those fronts are state or local by default, with no redundancy risk.</w:t>
       </w:r>
     </w:p>
     <w:p>
       <w:pPr>
+        <w:widowControl/>
         <w:spacing w:before="100" w:after="50" w:lineRule="auto" w:line="254"/>
       </w:pPr>
       <w:r>
@@ -982,6 +1023,7 @@
     </w:p>
     <w:p>
       <w:pPr>
+        <w:widowControl/>
         <w:spacing w:before="0" w:after="50" w:lineRule="auto" w:line="250"/>
       </w:pPr>
       <w:r>
@@ -992,11 +1034,12 @@
           <w:color w:val="666666"/>
           <w:sz w:val="15"/>
         </w:rPr>
-        <w:t>Who has carried these bills, where bills stop, and which authors remain in the Legislature.</w:t>
+        <w:t>Who has carried these bills, where bills stop, and which authors remain in the Legislature.</w:t>
       </w:r>
     </w:p>
     <w:p>
       <w:pPr>
+        <w:widowControl/>
         <w:spacing w:before="0" w:after="64" w:lineRule="auto" w:line="250"/>
         <w:jc w:val="both"/>
       </w:pPr>
@@ -1007,11 +1050,12 @@
           <w:color w:val="444444"/>
           <w:sz w:val="17"/>
         </w:rPr>
-        <w:t>A slight majority of the 108 bills (58) were committee-sponsored. Senator Pete Goicoechea (R), the most frequent individual sponsor — 14 bills across all four sessions, concentrated in groundwater, districts, and rights retirement — left the Legislature after the 2023 session. Of the other frequent sponsors, Assemblymember Howard Watts (D, five bills) still serves; Senator Chris Brooks (D) and Assemblymember Sarah Peters (D), five each, have left. The active portfolio sits with current members Assemblymembers Bert Gurr (R) and Rich DeLong (R) and Senators Robin Titus (R) and Edgar Flores (D), each with three or four bills in 2023–2025. Cross-party sponsor teams were rare — five bills — but four of the five became law. Abatement and incentive bills route through the Revenue committees; water policy routes through Natural Resources, where most early deaths occurred (27 bills stopped in their first committee, 15 of them in a Natural Resources committee).</w:t>
+        <w:t>A slight majority of the 108 bills (58) were committee-sponsored. Senator Pete Goicoechea (R), the most frequent individual sponsor — 14 bills across all four sessions, concentrated in groundwater, districts, and rights retirement — left the Legislature after the 2023 session. Of the other frequent sponsors, Assemblymember Howard Watts (D, five bills) still serves; Senator Chris Brooks (D) and Assemblymember Sarah Peters (D), five each, have left. The active portfolio sits with current members Assemblymembers Bert Gurr (R) and Rich DeLong (R) and Senators Robin Titus (R) and Edgar Flores (D), each with three or four bills in 2023–2025. Cross-party sponsor teams were rare — five bills — but four of the five became law. Abatement and incentive bills route through the Revenue committees; water policy routes through Natural Resources, where most early deaths occurred (27 bills stopped in their first committee, 15 of them in a Natural Resources committee).</w:t>
       </w:r>
     </w:p>
     <w:p>
       <w:pPr>
+        <w:widowControl/>
         <w:spacing w:before="160" w:after="0" w:lineRule="auto" w:line="254"/>
         <w:pBdr>
           <w:top w:val="single" w:sz="6" w:space="4" w:color="C8CDD6"/>

</xml_diff>

<commit_message>
Water scarcity v3: readable type (10pt+ body, 12pt+ headers), sponsors folded into momentum map
Co-authored-by: CaptainWrechols <CaptainWrechols@users.noreply.github.com>
</commit_message>
<xml_diff>
--- a/briefs/nevada/water-scarcity/citizen-v3/citizen-brief.docx
+++ b/briefs/nevada/water-scarcity/citizen-v3/citizen-brief.docx
@@ -12,7 +12,7 @@
           <w:rFonts w:ascii="Arial" w:hAnsi="Arial" w:cs="Arial" w:eastAsia="Arial"/>
           <w:b/>
           <w:color w:val="1A2D4F"/>
-          <w:sz w:val="18"/>
+          <w:sz w:val="20"/>
           <w:spacing w:val="20"/>
         </w:rPr>
         <w:t>T H E   F O R U M</w:t>
@@ -37,7 +37,7 @@
           <w:rFonts w:ascii="Arial" w:hAnsi="Arial" w:cs="Arial" w:eastAsia="Arial"/>
           <w:b/>
           <w:color w:val="1A2D4F"/>
-          <w:sz w:val="34"/>
+          <w:sz w:val="36"/>
         </w:rPr>
         <w:t>Growth, Water Scarcity, and Long-Term Supply in Nevada</w:t>
       </w:r>
@@ -52,7 +52,7 @@
           <w:rFonts w:ascii="Arial" w:hAnsi="Arial" w:cs="Arial" w:eastAsia="Arial"/>
           <w:b w:val="0"/>
           <w:color w:val="444444"/>
-          <w:sz w:val="17"/>
+          <w:sz w:val="20"/>
         </w:rPr>
         <w:t>The legislative record behind Nevadans' ten most common water proposals, 2019–2025 — organized by how far each idea has traveled toward law.</w:t>
       </w:r>
@@ -60,23 +60,23 @@
     <w:p>
       <w:pPr>
         <w:widowControl/>
-        <w:spacing w:before="100" w:after="50" w:lineRule="auto" w:line="254"/>
+        <w:spacing w:before="100" w:after="40" w:lineRule="auto" w:line="254"/>
       </w:pPr>
       <w:r>
         <w:rPr>
           <w:rFonts w:ascii="Arial" w:hAnsi="Arial" w:cs="Arial" w:eastAsia="Arial"/>
           <w:b/>
           <w:color w:val="C0392B"/>
-          <w:sz w:val="21"/>
+          <w:sz w:val="25"/>
           <w:spacing w:val="20"/>
         </w:rPr>
-        <w:t>WHAT THIS BRIEF COVERS AND HOW IT IS ORGANIZED</w:t>
+        <w:t>WHAT THIS BRIEF COVERS</w:t>
       </w:r>
     </w:p>
     <w:p>
       <w:pPr>
         <w:widowControl/>
-        <w:spacing w:before="0" w:after="64" w:lineRule="auto" w:line="250"/>
+        <w:spacing w:before="0" w:after="56" w:lineRule="auto" w:line="247"/>
         <w:jc w:val="both"/>
       </w:pPr>
       <w:r>
@@ -84,41 +84,9 @@
           <w:rFonts w:ascii="Arial" w:hAnsi="Arial" w:cs="Arial" w:eastAsia="Arial"/>
           <w:b w:val="0"/>
           <w:color w:val="444444"/>
-          <w:sz w:val="17"/>
+          <w:sz w:val="20"/>
         </w:rPr>
-        <w:t>Nevada's Legislature took up 108 water and large-user bills across its 2019, 2021, 2023, and 2025 sessions, and 59 became law — water legislation moves in Carson City every session. Several of the reforms Nevadans proposed have traveled farther than a first glance suggests: four bills passed both chambers since 2023 and stopped one step short of statute, and others cleared a full chamber or a committee before running out of calendar. The sections below sort the record by distance traveled — bills that reached the governor's desk first, then bills with a winning vote behind them, then settled law and its openings, then the routes with no traction yet — with notes on momentum, federal overlap, and sponsors.</w:t>
-      </w:r>
-    </w:p>
-    <w:p>
-      <w:pPr>
-        <w:widowControl/>
-        <w:spacing w:before="100" w:after="50" w:lineRule="auto" w:line="254"/>
-      </w:pPr>
-      <w:r>
-        <w:rPr>
-          <w:rFonts w:ascii="Arial" w:hAnsi="Arial" w:cs="Arial" w:eastAsia="Arial"/>
-          <w:b/>
-          <w:color w:val="C0392B"/>
-          <w:sz w:val="21"/>
-          <w:spacing w:val="20"/>
-        </w:rPr>
-        <w:t>KEY NUMBERS: HOW FAR THESE PROPOSALS HAVE TRAVELED</w:t>
-      </w:r>
-    </w:p>
-    <w:p>
-      <w:pPr>
-        <w:widowControl/>
-        <w:spacing w:before="0" w:after="60" w:lineRule="auto" w:line="254"/>
-      </w:pPr>
-      <w:r>
-        <w:rPr>
-          <w:rFonts w:ascii="Arial" w:hAnsi="Arial" w:cs="Arial" w:eastAsia="Arial"/>
-          <w:b w:val="0"/>
-          <w:i/>
-          <w:color w:val="666666"/>
-          <w:sz w:val="16"/>
-        </w:rPr>
-        <w:t>Each figure below is unpacked, bill by bill, in the section it points to.</w:t>
+        <w:t>Nevada's Legislature took up 108 water and large-user bills across its 2019, 2021, 2023, and 2025 sessions, and 59 became law — water legislation moves in Carson City every session. Several of the reforms Nevadans proposed have traveled farther than a first glance suggests: four bills passed both chambers since 2023 and stopped one step short of statute, and others cleared a full chamber or a committee before running out of calendar.</w:t>
       </w:r>
     </w:p>
     <w:tbl>
@@ -129,16 +97,15 @@
         <w:tblLook w:firstColumn="1" w:firstRow="1" w:lastColumn="0" w:lastRow="0" w:noHBand="0" w:noVBand="1" w:val="04A0"/>
       </w:tblPr>
       <w:tblGrid>
-        <w:gridCol w:w="2102"/>
-        <w:gridCol w:w="2102"/>
-        <w:gridCol w:w="2102"/>
-        <w:gridCol w:w="2102"/>
-        <w:gridCol w:w="2102"/>
+        <w:gridCol w:w="2628"/>
+        <w:gridCol w:w="2628"/>
+        <w:gridCol w:w="2628"/>
+        <w:gridCol w:w="2628"/>
       </w:tblGrid>
       <w:tr>
         <w:tc>
           <w:tcPr>
-            <w:tcW w:type="dxa" w:w="2102"/>
+            <w:tcW w:type="dxa" w:w="2628"/>
             <w:tcBorders>
               <w:top w:val="single" w:sz="24" w:space="0" w:color="1A2D4F"/>
               <w:left w:val="single" w:sz="4" w:space="0" w:color="CCCCCC"/>
@@ -161,7 +128,7 @@
                 <w:rFonts w:ascii="Arial" w:hAnsi="Arial" w:cs="Arial" w:eastAsia="Arial"/>
                 <w:b/>
                 <w:color w:val="1A2D4F"/>
-                <w:sz w:val="30"/>
+                <w:sz w:val="36"/>
               </w:rPr>
               <w:t>108</w:t>
             </w:r>
@@ -175,15 +142,15 @@
                 <w:rFonts w:ascii="Arial" w:hAnsi="Arial" w:cs="Arial" w:eastAsia="Arial"/>
                 <w:b w:val="0"/>
                 <w:color w:val="666666"/>
-                <w:sz w:val="13"/>
+                <w:sz w:val="20"/>
               </w:rPr>
-              <w:t>water and large-user bills taken up, 2019–2025</w:t>
+              <w:t>water and large-user bills, 2019–2025</w:t>
             </w:r>
           </w:p>
         </w:tc>
         <w:tc>
           <w:tcPr>
-            <w:tcW w:type="dxa" w:w="2102"/>
+            <w:tcW w:type="dxa" w:w="2628"/>
             <w:tcBorders>
               <w:top w:val="single" w:sz="24" w:space="0" w:color="1A2D4F"/>
               <w:left w:val="single" w:sz="4" w:space="0" w:color="CCCCCC"/>
@@ -206,7 +173,7 @@
                 <w:rFonts w:ascii="Arial" w:hAnsi="Arial" w:cs="Arial" w:eastAsia="Arial"/>
                 <w:b/>
                 <w:color w:val="1A2D4F"/>
-                <w:sz w:val="30"/>
+                <w:sz w:val="36"/>
               </w:rPr>
               <w:t>59</w:t>
             </w:r>
@@ -220,7 +187,7 @@
                 <w:rFonts w:ascii="Arial" w:hAnsi="Arial" w:cs="Arial" w:eastAsia="Arial"/>
                 <w:b w:val="0"/>
                 <w:color w:val="666666"/>
-                <w:sz w:val="13"/>
+                <w:sz w:val="20"/>
               </w:rPr>
               <w:t>became law</w:t>
             </w:r>
@@ -228,7 +195,7 @@
         </w:tc>
         <w:tc>
           <w:tcPr>
-            <w:tcW w:type="dxa" w:w="2102"/>
+            <w:tcW w:type="dxa" w:w="2628"/>
             <w:tcBorders>
               <w:top w:val="single" w:sz="24" w:space="0" w:color="1A2D4F"/>
               <w:left w:val="single" w:sz="4" w:space="0" w:color="CCCCCC"/>
@@ -251,7 +218,7 @@
                 <w:rFonts w:ascii="Arial" w:hAnsi="Arial" w:cs="Arial" w:eastAsia="Arial"/>
                 <w:b/>
                 <w:color w:val="1A2D4F"/>
-                <w:sz w:val="30"/>
+                <w:sz w:val="36"/>
               </w:rPr>
               <w:t>4</w:t>
             </w:r>
@@ -265,15 +232,15 @@
                 <w:rFonts w:ascii="Arial" w:hAnsi="Arial" w:cs="Arial" w:eastAsia="Arial"/>
                 <w:b w:val="0"/>
                 <w:color w:val="666666"/>
-                <w:sz w:val="13"/>
+                <w:sz w:val="20"/>
               </w:rPr>
-              <w:t>bills passed both chambers since 2023 and stopped at the last step — SB429, SB169, AB97 (vetoed) and SB180 (out of time)</w:t>
+              <w:t>passed both chambers, stopped at the last step</w:t>
             </w:r>
           </w:p>
         </w:tc>
         <w:tc>
           <w:tcPr>
-            <w:tcW w:type="dxa" w:w="2102"/>
+            <w:tcW w:type="dxa" w:w="2628"/>
             <w:tcBorders>
               <w:top w:val="single" w:sz="24" w:space="0" w:color="1A2D4F"/>
               <w:left w:val="single" w:sz="4" w:space="0" w:color="CCCCCC"/>
@@ -296,52 +263,7 @@
                 <w:rFonts w:ascii="Arial" w:hAnsi="Arial" w:cs="Arial" w:eastAsia="Arial"/>
                 <w:b/>
                 <w:color w:val="1A2D4F"/>
-                <w:sz w:val="30"/>
-              </w:rPr>
-              <w:t>21–0</w:t>
-            </w:r>
-          </w:p>
-          <w:p>
-            <w:pPr>
-              <w:spacing w:after="0" w:line="240" w:lineRule="auto"/>
-            </w:pPr>
-            <w:r>
-              <w:rPr>
-                <w:rFonts w:ascii="Arial" w:hAnsi="Arial" w:cs="Arial" w:eastAsia="Arial"/>
-                <w:b w:val="0"/>
-                <w:color w:val="666666"/>
-                <w:sz w:val="13"/>
-              </w:rPr>
-              <w:t>the Senate's vote on SB143 (2025), the stalled statewide conservation review</w:t>
-            </w:r>
-          </w:p>
-        </w:tc>
-        <w:tc>
-          <w:tcPr>
-            <w:tcW w:type="dxa" w:w="2102"/>
-            <w:tcBorders>
-              <w:top w:val="single" w:sz="24" w:space="0" w:color="1A2D4F"/>
-              <w:left w:val="single" w:sz="4" w:space="0" w:color="CCCCCC"/>
-              <w:bottom w:val="single" w:sz="4" w:space="0" w:color="CCCCCC"/>
-              <w:right w:val="single" w:sz="4" w:space="0" w:color="CCCCCC"/>
-            </w:tcBorders>
-            <w:tcMar>
-              <w:top w:w="50" w:type="dxa"/>
-              <w:left w:w="90" w:type="dxa"/>
-              <w:bottom w:w="60" w:type="dxa"/>
-              <w:right w:w="90" w:type="dxa"/>
-            </w:tcMar>
-          </w:tcPr>
-          <w:p>
-            <w:pPr>
-              <w:spacing w:after="20"/>
-            </w:pPr>
-            <w:r>
-              <w:rPr>
-                <w:rFonts w:ascii="Arial" w:hAnsi="Arial" w:cs="Arial" w:eastAsia="Arial"/>
-                <w:b/>
-                <w:color w:val="1A2D4F"/>
-                <w:sz w:val="23"/>
+                <w:sz w:val="28"/>
               </w:rPr>
               <w:t>5 of 10</w:t>
             </w:r>
@@ -355,9 +277,9 @@
                 <w:rFonts w:ascii="Arial" w:hAnsi="Arial" w:cs="Arial" w:eastAsia="Arial"/>
                 <w:b w:val="0"/>
                 <w:color w:val="666666"/>
-                <w:sz w:val="13"/>
+                <w:sz w:val="20"/>
               </w:rPr>
-              <w:t>citizen proposals never yet filed as a bill</w:t>
+              <w:t>citizen proposals never filed as a bill</w:t>
             </w:r>
           </w:p>
         </w:tc>
@@ -366,20 +288,20 @@
     <w:p>
       <w:pPr>
         <w:widowControl/>
-        <w:spacing w:before="0" w:after="100" w:lineRule="auto" w:line="254"/>
+        <w:spacing w:before="0" w:after="60" w:lineRule="auto" w:line="254"/>
       </w:pPr>
     </w:p>
     <w:p>
       <w:pPr>
         <w:widowControl/>
-        <w:spacing w:before="100" w:after="50" w:lineRule="auto" w:line="254"/>
+        <w:spacing w:before="100" w:after="40" w:lineRule="auto" w:line="254"/>
       </w:pPr>
       <w:r>
         <w:rPr>
           <w:rFonts w:ascii="Arial" w:hAnsi="Arial" w:cs="Arial" w:eastAsia="Arial"/>
           <w:b/>
           <w:color w:val="C0392B"/>
-          <w:sz w:val="21"/>
+          <w:sz w:val="25"/>
           <w:spacing w:val="20"/>
         </w:rPr>
         <w:t>CLOSEST TO LAW: BILLS THAT PASSED BOTH CHAMBERS</w:t>
@@ -388,7 +310,7 @@
     <w:p>
       <w:pPr>
         <w:widowControl/>
-        <w:spacing w:before="0" w:after="50" w:lineRule="auto" w:line="250"/>
+        <w:spacing w:before="0" w:after="40" w:lineRule="auto" w:line="247"/>
       </w:pPr>
       <w:r>
         <w:rPr>
@@ -396,22 +318,22 @@
           <w:b w:val="0"/>
           <w:i/>
           <w:color w:val="666666"/>
-          <w:sz w:val="15"/>
+          <w:sz w:val="20"/>
         </w:rPr>
-        <w:t>These bills assembled majorities in both houses; only a veto or the session clock separated them from statute — the record's most advanced unfinished work.</w:t>
+        <w:t>Majorities in both houses already; only a veto or the clock stopped these bills.</w:t>
       </w:r>
     </w:p>
     <w:p>
       <w:pPr>
         <w:widowControl/>
-        <w:spacing w:before="70" w:after="30" w:lineRule="auto" w:line="250"/>
+        <w:spacing w:before="80" w:after="30" w:lineRule="auto" w:line="250"/>
       </w:pPr>
       <w:r>
         <w:rPr>
           <w:rFonts w:ascii="Arial" w:hAnsi="Arial" w:cs="Arial" w:eastAsia="Arial"/>
           <w:b/>
           <w:color w:val="2E4A78"/>
-          <w:sz w:val="18"/>
+          <w:sz w:val="24"/>
         </w:rPr>
         <w:t>Vetoed at the governor's desk (2023)</w:t>
       </w:r>
@@ -419,7 +341,7 @@
     <w:p>
       <w:pPr>
         <w:widowControl/>
-        <w:spacing w:before="0" w:after="64" w:lineRule="auto" w:line="250"/>
+        <w:spacing w:before="0" w:after="56" w:lineRule="auto" w:line="247"/>
         <w:jc w:val="both"/>
       </w:pPr>
       <w:r>
@@ -427,7 +349,7 @@
           <w:rFonts w:ascii="Arial" w:hAnsi="Arial" w:cs="Arial" w:eastAsia="Arial"/>
           <w:b/>
           <w:color w:val="1A2D4F"/>
-          <w:sz w:val="17"/>
+          <w:sz w:val="20"/>
         </w:rPr>
         <w:t>Conditions on tax abatements — SB429.</w:t>
       </w:r>
@@ -436,7 +358,7 @@
           <w:rFonts w:ascii="Arial" w:hAnsi="Arial" w:cs="Arial" w:eastAsia="Arial"/>
           <w:b w:val="0"/>
           <w:color w:val="444444"/>
-          <w:sz w:val="17"/>
+          <w:sz w:val="20"/>
         </w:rPr>
         <w:t xml:space="preserve"> Attached family-leave conditions to the up-front tax abatements that recruit large water users; passed both houses and was vetoed. It is the only abatement-conditions design to clear the full Legislature.</w:t>
       </w:r>
@@ -444,7 +366,7 @@
     <w:p>
       <w:pPr>
         <w:widowControl/>
-        <w:spacing w:before="0" w:after="64" w:lineRule="auto" w:line="250"/>
+        <w:spacing w:before="0" w:after="56" w:lineRule="auto" w:line="247"/>
         <w:jc w:val="both"/>
       </w:pPr>
       <w:r>
@@ -452,7 +374,7 @@
           <w:rFonts w:ascii="Arial" w:hAnsi="Arial" w:cs="Arial" w:eastAsia="Arial"/>
           <w:b/>
           <w:color w:val="1A2D4F"/>
-          <w:sz w:val="17"/>
+          <w:sz w:val="20"/>
         </w:rPr>
         <w:t>Conservation in local master plans — SB169.</w:t>
       </w:r>
@@ -461,7 +383,7 @@
           <w:rFonts w:ascii="Arial" w:hAnsi="Arial" w:cs="Arial" w:eastAsia="Arial"/>
           <w:b w:val="0"/>
           <w:color w:val="444444"/>
-          <w:sz w:val="17"/>
+          <w:sz w:val="20"/>
         </w:rPr>
         <w:t xml:space="preserve"> Added conservation elements to local government master plans; passed both houses and was vetoed.</w:t>
       </w:r>
@@ -469,7 +391,7 @@
     <w:p>
       <w:pPr>
         <w:widowControl/>
-        <w:spacing w:before="0" w:after="64" w:lineRule="auto" w:line="250"/>
+        <w:spacing w:before="0" w:after="56" w:lineRule="auto" w:line="247"/>
         <w:jc w:val="both"/>
       </w:pPr>
       <w:r>
@@ -477,7 +399,7 @@
           <w:rFonts w:ascii="Arial" w:hAnsi="Arial" w:cs="Arial" w:eastAsia="Arial"/>
           <w:b/>
           <w:color w:val="1A2D4F"/>
-          <w:sz w:val="17"/>
+          <w:sz w:val="20"/>
         </w:rPr>
         <w:t>Local cooling-equipment rules — AB97.</w:t>
       </w:r>
@@ -486,7 +408,7 @@
           <w:rFonts w:ascii="Arial" w:hAnsi="Arial" w:cs="Arial" w:eastAsia="Arial"/>
           <w:b w:val="0"/>
           <w:color w:val="444444"/>
-          <w:sz w:val="17"/>
+          <w:sz w:val="20"/>
         </w:rPr>
         <w:t xml:space="preserve"> Would have blocked local governments from banning newer refrigerants in cooling equipment; passed 42–0 and 20–0 — unanimous in both chambers — and was vetoed. Its sponsor, Assemblymember Melissa Hardy (R), is still a member of the Assembly.</w:t>
       </w:r>
@@ -494,14 +416,14 @@
     <w:p>
       <w:pPr>
         <w:widowControl/>
-        <w:spacing w:before="70" w:after="30" w:lineRule="auto" w:line="250"/>
+        <w:spacing w:before="80" w:after="30" w:lineRule="auto" w:line="250"/>
       </w:pPr>
       <w:r>
         <w:rPr>
           <w:rFonts w:ascii="Arial" w:hAnsi="Arial" w:cs="Arial" w:eastAsia="Arial"/>
           <w:b/>
           <w:color w:val="2E4A78"/>
-          <w:sz w:val="18"/>
+          <w:sz w:val="24"/>
         </w:rPr>
         <w:t>Passed both chambers, lost to the clock</w:t>
       </w:r>
@@ -509,7 +431,7 @@
     <w:p>
       <w:pPr>
         <w:widowControl/>
-        <w:spacing w:before="0" w:after="64" w:lineRule="auto" w:line="250"/>
+        <w:spacing w:before="0" w:after="56" w:lineRule="auto" w:line="247"/>
         <w:jc w:val="both"/>
       </w:pPr>
       <w:r>
@@ -517,7 +439,7 @@
           <w:rFonts w:ascii="Arial" w:hAnsi="Arial" w:cs="Arial" w:eastAsia="Arial"/>
           <w:b/>
           <w:color w:val="1A2D4F"/>
-          <w:sz w:val="17"/>
+          <w:sz w:val="20"/>
         </w:rPr>
         <w:t>Groundwater board restructuring — SB180 (2023).</w:t>
       </w:r>
@@ -526,7 +448,7 @@
           <w:rFonts w:ascii="Arial" w:hAnsi="Arial" w:cs="Arial" w:eastAsia="Arial"/>
           <w:b w:val="0"/>
           <w:color w:val="444444"/>
-          <w:sz w:val="17"/>
+          <w:sz w:val="20"/>
         </w:rPr>
         <w:t xml:space="preserve"> Passed both houses with zero "no" votes and still died at session's end without reaching the governor. The 2025 retry, AB363, cleared its committee and died on the Assembly floor calendar. Two sessions of near-unanimous support make this the record's clearest piece of unfinished business.</w:t>
       </w:r>
@@ -534,23 +456,23 @@
     <w:p>
       <w:pPr>
         <w:widowControl/>
-        <w:spacing w:before="100" w:after="50" w:lineRule="auto" w:line="254"/>
+        <w:spacing w:before="100" w:after="40" w:lineRule="auto" w:line="254"/>
       </w:pPr>
       <w:r>
         <w:rPr>
           <w:rFonts w:ascii="Arial" w:hAnsi="Arial" w:cs="Arial" w:eastAsia="Arial"/>
           <w:b/>
           <w:color w:val="C0392B"/>
-          <w:sz w:val="21"/>
+          <w:sz w:val="25"/>
           <w:spacing w:val="20"/>
         </w:rPr>
-        <w:t>PROVEN SUPPORT: BILLS THAT CLEARED A CHAMBER OR A COMMITTEE</w:t>
+        <w:t>PROVEN SUPPORT: CLEARED A CHAMBER OR A COMMITTEE</w:t>
       </w:r>
     </w:p>
     <w:p>
       <w:pPr>
         <w:widowControl/>
-        <w:spacing w:before="0" w:after="50" w:lineRule="auto" w:line="250"/>
+        <w:spacing w:before="0" w:after="40" w:lineRule="auto" w:line="247"/>
       </w:pPr>
       <w:r>
         <w:rPr>
@@ -558,15 +480,15 @@
           <w:b w:val="0"/>
           <w:i/>
           <w:color w:val="666666"/>
-          <w:sz w:val="15"/>
+          <w:sz w:val="20"/>
         </w:rPr>
-        <w:t>Each bill here won a recorded majority — in committee or on a floor — before stalling: the strongest signal short of passage.</w:t>
+        <w:t>Each bill won a committee or floor majority before stalling.</w:t>
       </w:r>
     </w:p>
     <w:p>
       <w:pPr>
         <w:widowControl/>
-        <w:spacing w:before="0" w:after="64" w:lineRule="auto" w:line="250"/>
+        <w:spacing w:before="0" w:after="56" w:lineRule="auto" w:line="247"/>
         <w:jc w:val="both"/>
       </w:pPr>
       <w:r>
@@ -574,7 +496,7 @@
           <w:rFonts w:ascii="Arial" w:hAnsi="Arial" w:cs="Arial" w:eastAsia="Arial"/>
           <w:b/>
           <w:color w:val="1A2D4F"/>
-          <w:sz w:val="17"/>
+          <w:sz w:val="20"/>
         </w:rPr>
         <w:t>A statewide expert water body — SB143 (2025).</w:t>
       </w:r>
@@ -583,7 +505,7 @@
           <w:rFonts w:ascii="Arial" w:hAnsi="Arial" w:cs="Arial" w:eastAsia="Arial"/>
           <w:b w:val="0"/>
           <w:color w:val="444444"/>
-          <w:sz w:val="17"/>
+          <w:sz w:val="20"/>
         </w:rPr>
         <w:t xml:space="preserve"> Directed an interim review of water conservation policy; passed the Senate 21–0 and died in the Assembly. The earlier version, SB499 (2019), never left its first committee — so the idea's newest test is also its strongest showing. No Economic Forum-style water body exists in statute.</w:t>
       </w:r>
@@ -591,7 +513,7 @@
     <w:p>
       <w:pPr>
         <w:widowControl/>
-        <w:spacing w:before="0" w:after="64" w:lineRule="auto" w:line="250"/>
+        <w:spacing w:before="0" w:after="56" w:lineRule="auto" w:line="247"/>
         <w:jc w:val="both"/>
       </w:pPr>
       <w:r>
@@ -599,7 +521,7 @@
           <w:rFonts w:ascii="Arial" w:hAnsi="Arial" w:cs="Arial" w:eastAsia="Arial"/>
           <w:b/>
           <w:color w:val="1A2D4F"/>
-          <w:sz w:val="17"/>
+          <w:sz w:val="20"/>
         </w:rPr>
         <w:t>Science-based statewide standards — AB387 (2023).</w:t>
       </w:r>
@@ -608,7 +530,7 @@
           <w:rFonts w:ascii="Arial" w:hAnsi="Arial" w:cs="Arial" w:eastAsia="Arial"/>
           <w:b w:val="0"/>
           <w:color w:val="444444"/>
-          <w:sz w:val="17"/>
+          <w:sz w:val="20"/>
         </w:rPr>
         <w:t xml:space="preserve"> Required the State Engineer to use the best available science; passed the Assembly 26–14 and died in the Senate.</w:t>
       </w:r>
@@ -616,7 +538,7 @@
     <w:p>
       <w:pPr>
         <w:widowControl/>
-        <w:spacing w:before="0" w:after="64" w:lineRule="auto" w:line="250"/>
+        <w:spacing w:before="0" w:after="56" w:lineRule="auto" w:line="247"/>
         <w:jc w:val="both"/>
       </w:pPr>
       <w:r>
@@ -624,7 +546,7 @@
           <w:rFonts w:ascii="Arial" w:hAnsi="Arial" w:cs="Arial" w:eastAsia="Arial"/>
           <w:b/>
           <w:color w:val="1A2D4F"/>
-          <w:sz w:val="17"/>
+          <w:sz w:val="20"/>
         </w:rPr>
         <w:t>Caps on abatements — SB394 (2023).</w:t>
       </w:r>
@@ -633,7 +555,7 @@
           <w:rFonts w:ascii="Arial" w:hAnsi="Arial" w:cs="Arial" w:eastAsia="Arial"/>
           <w:b w:val="0"/>
           <w:color w:val="444444"/>
-          <w:sz w:val="17"/>
+          <w:sz w:val="20"/>
         </w:rPr>
         <w:t xml:space="preserve"> A $500,000 abatement cap; passed the Senate 14–7 and died in Assembly Revenue at the deadline. </w:t>
       </w:r>
@@ -642,7 +564,7 @@
           <w:rFonts w:ascii="Arial" w:hAnsi="Arial" w:cs="Arial" w:eastAsia="Arial"/>
           <w:b/>
           <w:color w:val="1A2D4F"/>
-          <w:sz w:val="17"/>
+          <w:sz w:val="20"/>
         </w:rPr>
         <w:t>SB364 (2025)</w:t>
       </w:r>
@@ -651,7 +573,7 @@
           <w:rFonts w:ascii="Arial" w:hAnsi="Arial" w:cs="Arial" w:eastAsia="Arial"/>
           <w:b w:val="0"/>
           <w:color w:val="444444"/>
-          <w:sz w:val="17"/>
+          <w:sz w:val="20"/>
         </w:rPr>
         <w:t>, conditioning data-center abatements, cleared its first committee and stalled on the Senate floor. Assembly Revenue is where abatement designs stop — but the Senate has now voted for one.</w:t>
       </w:r>
@@ -659,14 +581,14 @@
     <w:p>
       <w:pPr>
         <w:widowControl/>
-        <w:spacing w:before="100" w:after="50" w:lineRule="auto" w:line="254"/>
+        <w:spacing w:before="100" w:after="40" w:lineRule="auto" w:line="254"/>
       </w:pPr>
       <w:r>
         <w:rPr>
           <w:rFonts w:ascii="Arial" w:hAnsi="Arial" w:cs="Arial" w:eastAsia="Arial"/>
           <w:b/>
           <w:color w:val="C0392B"/>
-          <w:sz w:val="21"/>
+          <w:sz w:val="25"/>
           <w:spacing w:val="20"/>
         </w:rPr>
         <w:t>ALREADY LAW — AND THE OPENINGS AROUND IT</w:t>
@@ -675,7 +597,7 @@
     <w:p>
       <w:pPr>
         <w:widowControl/>
-        <w:spacing w:before="0" w:after="50" w:lineRule="auto" w:line="250"/>
+        <w:spacing w:before="0" w:after="40" w:lineRule="auto" w:line="247"/>
       </w:pPr>
       <w:r>
         <w:rPr>
@@ -683,22 +605,22 @@
           <w:b w:val="0"/>
           <w:i/>
           <w:color w:val="666666"/>
-          <w:sz w:val="15"/>
+          <w:sz w:val="20"/>
         </w:rPr>
-        <w:t>Fresh statutes mark ground unlikely to be revisited soon — and the lanes where the Legislature keeps building.</w:t>
+        <w:t>New law settles some ground — and shows where the Legislature keeps building.</w:t>
       </w:r>
     </w:p>
     <w:p>
       <w:pPr>
         <w:widowControl/>
-        <w:spacing w:before="70" w:after="30" w:lineRule="auto" w:line="250"/>
+        <w:spacing w:before="80" w:after="30" w:lineRule="auto" w:line="250"/>
       </w:pPr>
       <w:r>
         <w:rPr>
           <w:rFonts w:ascii="Arial" w:hAnsi="Arial" w:cs="Arial" w:eastAsia="Arial"/>
           <w:b/>
           <w:color w:val="2E4A78"/>
-          <w:sz w:val="18"/>
+          <w:sz w:val="24"/>
         </w:rPr>
         <w:t>Recently settled ground (2025 session)</w:t>
       </w:r>
@@ -706,7 +628,7 @@
     <w:p>
       <w:pPr>
         <w:widowControl/>
-        <w:spacing w:before="0" w:after="64" w:lineRule="auto" w:line="250"/>
+        <w:spacing w:before="0" w:after="56" w:lineRule="auto" w:line="247"/>
         <w:jc w:val="both"/>
       </w:pPr>
       <w:r>
@@ -714,7 +636,7 @@
           <w:rFonts w:ascii="Arial" w:hAnsi="Arial" w:cs="Arial" w:eastAsia="Arial"/>
           <w:b w:val="0"/>
           <w:color w:val="444444"/>
-          <w:sz w:val="17"/>
+          <w:sz w:val="20"/>
         </w:rPr>
         <w:t>SB36 created the state account to purchase and retire water rights in over-appropriated basins. SB6 funded cloud seeding a second time, unanimously. SB442 added utility shut-off protections; SB276 added public-notice requirements for water pollution permits with cross-party sponsorship; AB449 and SB326 simplified rate procedures for small water utilities; AB577 funded the water agency's records database. New proposals that restate these — another retirement account, another records appropriation — would duplicate fresh statute and are unlikely to advance.</w:t>
       </w:r>
@@ -722,14 +644,14 @@
     <w:p>
       <w:pPr>
         <w:widowControl/>
-        <w:spacing w:before="70" w:after="30" w:lineRule="auto" w:line="250"/>
+        <w:spacing w:before="80" w:after="30" w:lineRule="auto" w:line="250"/>
       </w:pPr>
       <w:r>
         <w:rPr>
           <w:rFonts w:ascii="Arial" w:hAnsi="Arial" w:cs="Arial" w:eastAsia="Arial"/>
           <w:b/>
           <w:color w:val="2E4A78"/>
-          <w:sz w:val="18"/>
+          <w:sz w:val="24"/>
         </w:rPr>
         <w:t>Where the record points further</w:t>
       </w:r>
@@ -737,7 +659,7 @@
     <w:p>
       <w:pPr>
         <w:widowControl/>
-        <w:spacing w:before="0" w:after="64" w:lineRule="auto" w:line="250"/>
+        <w:spacing w:before="0" w:after="56" w:lineRule="auto" w:line="247"/>
         <w:jc w:val="both"/>
       </w:pPr>
       <w:r>
@@ -745,7 +667,7 @@
           <w:rFonts w:ascii="Arial" w:hAnsi="Arial" w:cs="Arial" w:eastAsia="Arial"/>
           <w:b w:val="0"/>
           <w:color w:val="444444"/>
-          <w:sz w:val="17"/>
+          <w:sz w:val="20"/>
         </w:rPr>
         <w:t>SB36 is the pattern to watch: the buy-and-retire design failed in 2021 and 2023 before passing in 2025 — the Legislature returned to it until it worked. The precedents run the same way: AB356 (2021) banned decorative Colorado River grass in southern Nevada 21–0 and 42–0, proof that a hard restriction passes when regionally scoped; SB250 (2019) tied land divisions to water-right dedication, 39–0; AB95 (2019) required domestic-well metering in stressed basins and SB113 (2023) extended it; AB191 (2023) made suppliers audit their water losses. Each is a base that later bills have widened rather than a ceiling.</w:t>
       </w:r>
@@ -753,23 +675,23 @@
     <w:p>
       <w:pPr>
         <w:widowControl/>
-        <w:spacing w:before="100" w:after="50" w:lineRule="auto" w:line="254"/>
+        <w:spacing w:before="100" w:after="40" w:lineRule="auto" w:line="254"/>
       </w:pPr>
       <w:r>
         <w:rPr>
           <w:rFonts w:ascii="Arial" w:hAnsi="Arial" w:cs="Arial" w:eastAsia="Arial"/>
           <w:b/>
           <w:color w:val="C0392B"/>
-          <w:sz w:val="21"/>
+          <w:sz w:val="25"/>
           <w:spacing w:val="20"/>
         </w:rPr>
-        <w:t>ROUTES WITH LITTLE TRACTION: NEVER FILED OR STOPPED EARLY</w:t>
+        <w:t>LITTLE TRACTION YET: NEVER FILED OR STOPPED EARLY</w:t>
       </w:r>
     </w:p>
     <w:p>
       <w:pPr>
         <w:widowControl/>
-        <w:spacing w:before="0" w:after="50" w:lineRule="auto" w:line="250"/>
+        <w:spacing w:before="0" w:after="40" w:lineRule="auto" w:line="247"/>
       </w:pPr>
       <w:r>
         <w:rPr>
@@ -777,15 +699,15 @@
           <w:b w:val="0"/>
           <w:i/>
           <w:color w:val="666666"/>
-          <w:sz w:val="15"/>
+          <w:sz w:val="20"/>
         </w:rPr>
-        <w:t>Nothing here has won a vote — never filed, never heard in committee, or stopped early. The least-traveled routes: unproven rather than closed.</w:t>
+        <w:t>No votes yet: five of the ten citizen proposals were never filed; the rest stopped early.</w:t>
       </w:r>
     </w:p>
     <w:p>
       <w:pPr>
         <w:widowControl/>
-        <w:spacing w:before="0" w:after="64" w:lineRule="auto" w:line="250"/>
+        <w:spacing w:before="0" w:after="56" w:lineRule="auto" w:line="247"/>
         <w:jc w:val="both"/>
       </w:pPr>
       <w:r>
@@ -793,7 +715,7 @@
           <w:rFonts w:ascii="Arial" w:hAnsi="Arial" w:cs="Arial" w:eastAsia="Arial"/>
           <w:b/>
           <w:color w:val="1A2D4F"/>
-          <w:sz w:val="17"/>
+          <w:sz w:val="20"/>
         </w:rPr>
         <w:t>Statewide guardrails on data centers.</w:t>
       </w:r>
@@ -802,7 +724,7 @@
           <w:rFonts w:ascii="Arial" w:hAnsi="Arial" w:cs="Arial" w:eastAsia="Arial"/>
           <w:b w:val="0"/>
           <w:color w:val="444444"/>
-          <w:sz w:val="17"/>
+          <w:sz w:val="20"/>
         </w:rPr>
         <w:t xml:space="preserve"> Never filed. The existing statutes run the other way — SB547 (2019) let data centers run their own power equipment free of utility regulation, and the abatement statutes recruit them. Cooling rules are local (the Southern Nevada Water Authority's evaporative-cooling moratorium is a water-authority rule, not state law), and AB385 (2025), which would have barred local bans on large water-cooled towers, died in its first committee. The forward signal: interim committees studied data-center water and energy through 2026 for the 2027 session.</w:t>
       </w:r>
@@ -810,7 +732,7 @@
     <w:p>
       <w:pPr>
         <w:widowControl/>
-        <w:spacing w:before="0" w:after="64" w:lineRule="auto" w:line="250"/>
+        <w:spacing w:before="0" w:after="56" w:lineRule="auto" w:line="247"/>
         <w:jc w:val="both"/>
       </w:pPr>
       <w:r>
@@ -818,7 +740,7 @@
           <w:rFonts w:ascii="Arial" w:hAnsi="Arial" w:cs="Arial" w:eastAsia="Arial"/>
           <w:b/>
           <w:color w:val="1A2D4F"/>
-          <w:sz w:val="17"/>
+          <w:sz w:val="20"/>
         </w:rPr>
         <w:t>Statewide metering, waste fines, and reimbursement-style incentives.</w:t>
       </w:r>
@@ -827,7 +749,7 @@
           <w:rFonts w:ascii="Arial" w:hAnsi="Arial" w:cs="Arial" w:eastAsia="Arial"/>
           <w:b w:val="0"/>
           <w:color w:val="444444"/>
-          <w:sz w:val="17"/>
+          <w:sz w:val="20"/>
         </w:rPr>
         <w:t xml:space="preserve"> None has ever been filed. Metering's edges exist in law (AB95, SB113, AB191), but retail metering remains a city and utility decision. The nearest waste statute, AB537 (2019), raised penalties for pollution — not landscape watering. The reimbursement design participants developed — tax breaks paid only after public-benefit metrics are met — has never been introduced in any form.</w:t>
       </w:r>
@@ -835,7 +757,7 @@
     <w:p>
       <w:pPr>
         <w:widowControl/>
-        <w:spacing w:before="0" w:after="64" w:lineRule="auto" w:line="250"/>
+        <w:spacing w:before="0" w:after="56" w:lineRule="auto" w:line="247"/>
         <w:jc w:val="both"/>
       </w:pPr>
       <w:r>
@@ -843,7 +765,7 @@
           <w:rFonts w:ascii="Arial" w:hAnsi="Arial" w:cs="Arial" w:eastAsia="Arial"/>
           <w:b/>
           <w:color w:val="1A2D4F"/>
-          <w:sz w:val="17"/>
+          <w:sz w:val="20"/>
         </w:rPr>
         <w:t>"Bring your own water."</w:t>
       </w:r>
@@ -852,7 +774,7 @@
           <w:rFonts w:ascii="Arial" w:hAnsi="Arial" w:cs="Arial" w:eastAsia="Arial"/>
           <w:b w:val="0"/>
           <w:color w:val="444444"/>
-          <w:sz w:val="17"/>
+          <w:sz w:val="20"/>
         </w:rPr>
         <w:t xml:space="preserve"> Never filed statewide. Northern Nevada already operates this way — Truckee Meadows developers must dedicate water rights plus an 11 percent drought reserve — but by water-authority rule, not statute; SB250 (2019) is the nearest law.</w:t>
       </w:r>
@@ -860,7 +782,7 @@
     <w:p>
       <w:pPr>
         <w:widowControl/>
-        <w:spacing w:before="0" w:after="64" w:lineRule="auto" w:line="250"/>
+        <w:spacing w:before="0" w:after="56" w:lineRule="auto" w:line="247"/>
         <w:jc w:val="both"/>
       </w:pPr>
       <w:r>
@@ -868,7 +790,7 @@
           <w:rFonts w:ascii="Arial" w:hAnsi="Arial" w:cs="Arial" w:eastAsia="Arial"/>
           <w:b/>
           <w:color w:val="1A2D4F"/>
-          <w:sz w:val="17"/>
+          <w:sz w:val="20"/>
         </w:rPr>
         <w:t>The omnibus audit.</w:t>
       </w:r>
@@ -877,7 +799,7 @@
           <w:rFonts w:ascii="Arial" w:hAnsi="Arial" w:cs="Arial" w:eastAsia="Arial"/>
           <w:b w:val="0"/>
           <w:color w:val="444444"/>
-          <w:sz w:val="17"/>
+          <w:sz w:val="20"/>
         </w:rPr>
         <w:t xml:space="preserve"> AB485 (2025) — basin water budgets, monitoring, digitized records, staff for old claims — died in its first committee. But its pieces passed one by one: basin studies (AB95), critical management areas (SB113), the records database (AB577), the retirement account (SB36). The record's pattern is incremental, not omnibus. Early deaths also took AB51 (2019, conjunctive management), AB449 (2021) and AB77 (2025, abatement conditions in Assembly Revenue), and State Engineer oversight is 0-for-6 since 2021.</w:t>
       </w:r>
@@ -885,14 +807,14 @@
     <w:p>
       <w:pPr>
         <w:widowControl/>
-        <w:spacing w:before="100" w:after="50" w:lineRule="auto" w:line="254"/>
+        <w:spacing w:before="100" w:after="40" w:lineRule="auto" w:line="254"/>
       </w:pPr>
       <w:r>
         <w:rPr>
           <w:rFonts w:ascii="Arial" w:hAnsi="Arial" w:cs="Arial" w:eastAsia="Arial"/>
           <w:b/>
           <w:color w:val="C0392B"/>
-          <w:sz w:val="21"/>
+          <w:sz w:val="25"/>
           <w:spacing w:val="20"/>
         </w:rPr>
         <w:t>MOMENTUM MAP: ACTIVE FRONTS AND QUIET FRONTS</w:t>
@@ -901,23 +823,7 @@
     <w:p>
       <w:pPr>
         <w:widowControl/>
-        <w:spacing w:before="0" w:after="50" w:lineRule="auto" w:line="250"/>
-      </w:pPr>
-      <w:r>
-        <w:rPr>
-          <w:rFonts w:ascii="Arial" w:hAnsi="Arial" w:cs="Arial" w:eastAsia="Arial"/>
-          <w:b w:val="0"/>
-          <w:i/>
-          <w:color w:val="666666"/>
-          <w:sz w:val="15"/>
-        </w:rPr>
-        <w:t>Where bills keep appearing and advancing — and where the Legislature has not yet shown willingness to legislate.</w:t>
-      </w:r>
-    </w:p>
-    <w:p>
-      <w:pPr>
-        <w:widowControl/>
-        <w:spacing w:before="0" w:after="64" w:lineRule="auto" w:line="250"/>
+        <w:spacing w:before="0" w:after="56" w:lineRule="auto" w:line="247"/>
         <w:jc w:val="both"/>
       </w:pPr>
       <w:r>
@@ -925,7 +831,7 @@
           <w:rFonts w:ascii="Arial" w:hAnsi="Arial" w:cs="Arial" w:eastAsia="Arial"/>
           <w:b/>
           <w:color w:val="1A2D4F"/>
-          <w:sz w:val="17"/>
+          <w:sz w:val="20"/>
         </w:rPr>
         <w:t>Active:</w:t>
       </w:r>
@@ -934,7 +840,7 @@
           <w:rFonts w:ascii="Arial" w:hAnsi="Arial" w:cs="Arial" w:eastAsia="Arial"/>
           <w:b w:val="0"/>
           <w:color w:val="444444"/>
-          <w:sz w:val="17"/>
+          <w:sz w:val="20"/>
         </w:rPr>
         <w:t xml:space="preserve"> groundwater management and retirement (SB113, SB36, SB180, AB363 — bills every session, with rising success and near-unanimous votes); data-center water (no law yet, but filings and interim studies are multiplying — AB385, SB364, AB77, plus the 2026 interim work); regionally scoped conservation (AB356, SB250). </w:t>
       </w:r>
@@ -943,7 +849,7 @@
           <w:rFonts w:ascii="Arial" w:hAnsi="Arial" w:cs="Arial" w:eastAsia="Arial"/>
           <w:b/>
           <w:color w:val="1A2D4F"/>
-          <w:sz w:val="17"/>
+          <w:sz w:val="20"/>
         </w:rPr>
         <w:t>Quiet:</w:t>
       </w:r>
@@ -952,7 +858,7 @@
           <w:rFonts w:ascii="Arial" w:hAnsi="Arial" w:cs="Arial" w:eastAsia="Arial"/>
           <w:b w:val="0"/>
           <w:color w:val="444444"/>
-          <w:sz w:val="17"/>
+          <w:sz w:val="20"/>
         </w:rPr>
         <w:t xml:space="preserve"> statewide metering, escalating waste fines, and reimbursement-style incentives have never drawn a single bill; State Engineer oversight is 0-for-6; statewide (rather than regional) mandates have not yet found a sponsor who can move them.</w:t>
       </w:r>
@@ -960,23 +866,48 @@
     <w:p>
       <w:pPr>
         <w:widowControl/>
-        <w:spacing w:before="100" w:after="50" w:lineRule="auto" w:line="254"/>
+        <w:spacing w:before="0" w:after="56" w:lineRule="auto" w:line="247"/>
+        <w:jc w:val="both"/>
+      </w:pPr>
+      <w:r>
+        <w:rPr>
+          <w:rFonts w:ascii="Arial" w:hAnsi="Arial" w:cs="Arial" w:eastAsia="Arial"/>
+          <w:b/>
+          <w:color w:val="1A2D4F"/>
+          <w:sz w:val="20"/>
+        </w:rPr>
+        <w:t>Chokepoints and carriers.</w:t>
+      </w:r>
+      <w:r>
+        <w:rPr>
+          <w:rFonts w:ascii="Arial" w:hAnsi="Arial" w:cs="Arial" w:eastAsia="Arial"/>
+          <w:b w:val="0"/>
+          <w:color w:val="444444"/>
+          <w:sz w:val="20"/>
+        </w:rPr>
+        <w:t xml:space="preserve"> Water policy dies earliest in the Natural Resources committees — 27 bills stopped at their first committee, 15 of them there — and abatement bills stop in Revenue. Cross-party teams are rare but effective: four of five became law. The top sponsor, Senator Pete Goicoechea (R, 14 bills), has left the Legislature, as have Senator Chris Brooks (D) and Assemblymember Sarah Peters (D); Assemblymember Howard Watts (D) still serves, and current members Bert Gurr (R), Rich DeLong (R), Robin Titus (R), and Edgar Flores (D) carried the 2023–2025 bills.</w:t>
+      </w:r>
+    </w:p>
+    <w:p>
+      <w:pPr>
+        <w:widowControl/>
+        <w:spacing w:before="100" w:after="40" w:lineRule="auto" w:line="254"/>
       </w:pPr>
       <w:r>
         <w:rPr>
           <w:rFonts w:ascii="Arial" w:hAnsi="Arial" w:cs="Arial" w:eastAsia="Arial"/>
           <w:b/>
           <w:color w:val="C0392B"/>
-          <w:sz w:val="21"/>
+          <w:sz w:val="25"/>
           <w:spacing w:val="20"/>
         </w:rPr>
-        <w:t>FEDERAL OVERLAP: WHAT IS ALREADY ADDRESSED OUTSIDE CARSON CITY</w:t>
+        <w:t>FEDERAL OVERLAP: WHAT WASHINGTON ALREADY COVERS</w:t>
       </w:r>
     </w:p>
     <w:p>
       <w:pPr>
         <w:widowControl/>
-        <w:spacing w:before="0" w:after="50" w:lineRule="auto" w:line="250"/>
+        <w:spacing w:before="0" w:after="40" w:lineRule="auto" w:line="247"/>
       </w:pPr>
       <w:r>
         <w:rPr>
@@ -984,15 +915,15 @@
           <w:b w:val="0"/>
           <w:i/>
           <w:color w:val="666666"/>
-          <w:sz w:val="15"/>
+          <w:sz w:val="20"/>
         </w:rPr>
-        <w:t>Where federal action already covers ground, a state bill duplicates it; where none exists, the state route is the only one.</w:t>
+        <w:t>Where federal action already covers ground — and where the state route is the only one.</w:t>
       </w:r>
     </w:p>
     <w:p>
       <w:pPr>
         <w:widowControl/>
-        <w:spacing w:before="0" w:after="64" w:lineRule="auto" w:line="250"/>
+        <w:spacing w:before="0" w:after="56" w:lineRule="auto" w:line="247"/>
         <w:jc w:val="both"/>
       </w:pPr>
       <w:r>
@@ -1000,7 +931,7 @@
           <w:rFonts w:ascii="Arial" w:hAnsi="Arial" w:cs="Arial" w:eastAsia="Arial"/>
           <w:b w:val="0"/>
           <w:color w:val="444444"/>
-          <w:sz w:val="17"/>
+          <w:sz w:val="20"/>
         </w:rPr>
         <w:t>Nevada's Colorado River share is fixed by interstate compact and federal operations — the Bureau of Reclamation sets shortage rules, and the post-2026 operating guidelines are being negotiated at the federal level now — so state bills cannot change the allocation itself. Federal drought-response money appropriated in 2022 already pays Colorado River users for measured conservation, overlapping part of the reimbursement-incentive idea. By contrast, groundwater management, metering, waste enforcement, and data-center water standards have no federal statute: those fronts are state or local by default, with no redundancy risk.</w:t>
       </w:r>
@@ -1008,55 +939,7 @@
     <w:p>
       <w:pPr>
         <w:widowControl/>
-        <w:spacing w:before="100" w:after="50" w:lineRule="auto" w:line="254"/>
-      </w:pPr>
-      <w:r>
-        <w:rPr>
-          <w:rFonts w:ascii="Arial" w:hAnsi="Arial" w:cs="Arial" w:eastAsia="Arial"/>
-          <w:b/>
-          <w:color w:val="C0392B"/>
-          <w:sz w:val="21"/>
-          <w:spacing w:val="20"/>
-        </w:rPr>
-        <w:t>SPONSORS, COMMITTEES, AND WHO STILL SERVES</w:t>
-      </w:r>
-    </w:p>
-    <w:p>
-      <w:pPr>
-        <w:widowControl/>
-        <w:spacing w:before="0" w:after="50" w:lineRule="auto" w:line="250"/>
-      </w:pPr>
-      <w:r>
-        <w:rPr>
-          <w:rFonts w:ascii="Arial" w:hAnsi="Arial" w:cs="Arial" w:eastAsia="Arial"/>
-          <w:b w:val="0"/>
-          <w:i/>
-          <w:color w:val="666666"/>
-          <w:sz w:val="15"/>
-        </w:rPr>
-        <w:t>Who has carried these bills, where bills stop, and which authors remain in the Legislature.</w:t>
-      </w:r>
-    </w:p>
-    <w:p>
-      <w:pPr>
-        <w:widowControl/>
-        <w:spacing w:before="0" w:after="64" w:lineRule="auto" w:line="250"/>
-        <w:jc w:val="both"/>
-      </w:pPr>
-      <w:r>
-        <w:rPr>
-          <w:rFonts w:ascii="Arial" w:hAnsi="Arial" w:cs="Arial" w:eastAsia="Arial"/>
-          <w:b w:val="0"/>
-          <w:color w:val="444444"/>
-          <w:sz w:val="17"/>
-        </w:rPr>
-        <w:t>A slight majority of the 108 bills (58) were committee-sponsored. Senator Pete Goicoechea (R), the most frequent individual sponsor — 14 bills across all four sessions, concentrated in groundwater, districts, and rights retirement — left the Legislature after the 2023 session. Of the other frequent sponsors, Assemblymember Howard Watts (D, five bills) still serves; Senator Chris Brooks (D) and Assemblymember Sarah Peters (D), five each, have left. The active portfolio sits with current members Assemblymembers Bert Gurr (R) and Rich DeLong (R) and Senators Robin Titus (R) and Edgar Flores (D), each with three or four bills in 2023–2025. Cross-party sponsor teams were rare — five bills — but four of the five became law. Abatement and incentive bills route through the Revenue committees; water policy routes through Natural Resources, where most early deaths occurred (27 bills stopped in their first committee, 15 of them in a Natural Resources committee).</w:t>
-      </w:r>
-    </w:p>
-    <w:p>
-      <w:pPr>
-        <w:widowControl/>
-        <w:spacing w:before="160" w:after="0" w:lineRule="auto" w:line="254"/>
+        <w:spacing w:before="40" w:after="0" w:lineRule="auto" w:line="254"/>
         <w:pBdr>
           <w:top w:val="single" w:sz="6" w:space="4" w:color="C8CDD6"/>
         </w:pBdr>
@@ -1066,10 +949,10 @@
           <w:rFonts w:ascii="Arial" w:hAnsi="Arial" w:cs="Arial" w:eastAsia="Arial"/>
           <w:b w:val="0"/>
           <w:color w:val="666666"/>
-          <w:sz w:val="14"/>
-          <w:spacing w:val="12"/>
+          <w:sz w:val="20"/>
+          <w:spacing w:val="4"/>
         </w:rPr>
-        <w:t>FULL BILL-BY-BILL DETAIL, VOTES, SPONSORS, AND SOURCES: APPENDICES A–I.</w:t>
+        <w:t>Full detail, votes, sponsors, and sources: Appendices A–I.</w:t>
       </w:r>
     </w:p>
     <w:sectPr>

</xml_diff>